<commit_message>
Add local rolling trace file sink
</commit_message>
<xml_diff>
--- a/docs/planning/post-conference/_current/Chapter_2_Build_Steps.docx
+++ b/docs/planning/post-conference/_current/Chapter_2_Build_Steps.docx
@@ -23,10 +23,10 @@
         <w:tblLook w:val="04A0" w:firstRow="1" w:lastRow="0" w:firstColumn="1" w:lastColumn="0" w:noHBand="0" w:noVBand="1"/>
       </w:tblPr>
       <w:tblGrid>
-        <w:gridCol w:w="519"/>
-        <w:gridCol w:w="1594"/>
-        <w:gridCol w:w="3533"/>
-        <w:gridCol w:w="3804"/>
+        <w:gridCol w:w="737"/>
+        <w:gridCol w:w="1482"/>
+        <w:gridCol w:w="3904"/>
+        <w:gridCol w:w="3327"/>
       </w:tblGrid>
       <w:tr>
         <w:trPr>
@@ -723,7 +723,11 @@
           </w:tcPr>
           <w:p>
             <w:r>
-              <w:t>Demo account has Owner membership on the existing demo system</w:t>
+              <w:t xml:space="preserve">Demo account has Owner membership on the existing </w:t>
+            </w:r>
+            <w:r>
+              <w:lastRenderedPageBreak/>
+              <w:t>demo system</w:t>
             </w:r>
           </w:p>
         </w:tc>
@@ -1253,7 +1257,11 @@
             </w:r>
             <w:proofErr w:type="spellEnd"/>
             <w:r>
-              <w:t xml:space="preserve"> or equivalent is named and designed as PB runtime visibility authority</w:t>
+              <w:t xml:space="preserve"> or equivalent is named and designed as PB runtime visibility </w:t>
+            </w:r>
+            <w:r>
+              <w:lastRenderedPageBreak/>
+              <w:t>authority</w:t>
             </w:r>
           </w:p>
         </w:tc>
@@ -1270,6 +1278,7 @@
           </w:tcPr>
           <w:p>
             <w:r>
+              <w:lastRenderedPageBreak/>
               <w:t>19</w:t>
             </w:r>
           </w:p>
@@ -1311,11 +1320,7 @@
             </w:r>
             <w:proofErr w:type="spellEnd"/>
             <w:r>
-              <w:t xml:space="preserve"> remains untouched as SP import/export </w:t>
-            </w:r>
-            <w:r>
-              <w:lastRenderedPageBreak/>
-              <w:t>fidelity data</w:t>
+              <w:t xml:space="preserve"> remains untouched as SP import/export fidelity data</w:t>
             </w:r>
           </w:p>
         </w:tc>
@@ -1332,7 +1337,6 @@
           </w:tcPr>
           <w:p>
             <w:r>
-              <w:lastRenderedPageBreak/>
               <w:t>20</w:t>
             </w:r>
           </w:p>
@@ -1561,6 +1565,96 @@
           </w:tcPr>
           <w:p>
             <w:r>
+              <w:t>24-Prereq</w:t>
+            </w:r>
+          </w:p>
+        </w:tc>
+        <w:tc>
+          <w:tcPr>
+            <w:tcW w:w="0" w:type="auto"/>
+            <w:vAlign w:val="center"/>
+          </w:tcPr>
+          <w:p>
+            <w:r>
+              <w:t>Add local rolling trace file sink</w:t>
+            </w:r>
+          </w:p>
+        </w:tc>
+        <w:tc>
+          <w:tcPr>
+            <w:tcW w:w="0" w:type="auto"/>
+            <w:vAlign w:val="center"/>
+          </w:tcPr>
+          <w:p>
+            <w:r>
+              <w:t xml:space="preserve">A durable local development log file for existing PB_LEVEL1_TRACE entries, using the current </w:t>
+            </w:r>
+            <w:proofErr w:type="spellStart"/>
+            <w:r>
+              <w:t>ILogger</w:t>
+            </w:r>
+            <w:proofErr w:type="spellEnd"/>
+            <w:r>
+              <w:t xml:space="preserve"> trace boundary without adding new trace facts or changing /</w:t>
+            </w:r>
+            <w:proofErr w:type="spellStart"/>
+            <w:r>
+              <w:t>api</w:t>
+            </w:r>
+            <w:proofErr w:type="spellEnd"/>
+            <w:r>
+              <w:t>/me behavior.</w:t>
+            </w:r>
+          </w:p>
+        </w:tc>
+        <w:tc>
+          <w:tcPr>
+            <w:tcW w:w="0" w:type="auto"/>
+            <w:vAlign w:val="center"/>
+          </w:tcPr>
+          <w:p>
+            <w:r>
+              <w:t>Running /</w:t>
+            </w:r>
+            <w:proofErr w:type="spellStart"/>
+            <w:r>
+              <w:t>api</w:t>
+            </w:r>
+            <w:proofErr w:type="spellEnd"/>
+            <w:r>
+              <w:t xml:space="preserve">/me writes the existing Level 1 trace entries to a local rolling log file, the file can be searched for PB_LEVEL1_TRACE, </w:t>
+            </w:r>
+            <w:proofErr w:type="spellStart"/>
+            <w:r>
+              <w:t>TraceId</w:t>
+            </w:r>
+            <w:proofErr w:type="spellEnd"/>
+            <w:r>
+              <w:t xml:space="preserve">, </w:t>
+            </w:r>
+            <w:proofErr w:type="spellStart"/>
+            <w:r>
+              <w:t>CorrelationId</w:t>
+            </w:r>
+            <w:proofErr w:type="spellEnd"/>
+            <w:r>
+              <w:t>, Stage, and Outcome, and the API still builds and returns the verified owner path.</w:t>
+            </w:r>
+          </w:p>
+        </w:tc>
+      </w:tr>
+      <w:tr>
+        <w:trPr>
+          <w:tblCellSpacing w:w="15" w:type="dxa"/>
+        </w:trPr>
+        <w:tc>
+          <w:tcPr>
+            <w:tcW w:w="0" w:type="auto"/>
+            <w:vAlign w:val="center"/>
+          </w:tcPr>
+          <w:p>
+            <w:r>
+              <w:lastRenderedPageBreak/>
               <w:t>24</w:t>
             </w:r>
           </w:p>
@@ -2270,7 +2364,6 @@
   <w:style w:type="character" w:default="1" w:styleId="DefaultParagraphFont">
     <w:name w:val="Default Paragraph Font"/>
     <w:uiPriority w:val="1"/>
-    <w:semiHidden/>
     <w:unhideWhenUsed/>
   </w:style>
   <w:style w:type="table" w:default="1" w:styleId="TableNormal">

</xml_diff>